<commit_message>
Literatur Magerrasen und Fotoquellen
</commit_message>
<xml_diff>
--- a/Literatur Magerrasen.docx
+++ b/Literatur Magerrasen.docx
@@ -17,31 +17,13 @@
         <w:rPr>
           <w:lang w:val="en-US"/>
         </w:rPr>
-        <w:t>Beery, S., Cole, E., Parker, J., Perona, P., Winner, K. (2021)</w:t>
-      </w:r>
-      <w:r>
-        <w:rPr>
-          <w:lang w:val="en-US"/>
-        </w:rPr>
-        <w:t xml:space="preserve">: </w:t>
-      </w:r>
-      <w:r>
-        <w:rPr>
-          <w:lang w:val="en-US"/>
-        </w:rPr>
-        <w:t xml:space="preserve">Species Distribution Modeling for Machine Learning Practitioners: A Review. In Proceedings of the 2021 ACM SIGCAS Conference on Computing and Sustainable Societies (COMPASS ’21) (pp. 213–225). </w:t>
-      </w:r>
-      <w:r>
-        <w:rPr>
-          <w:lang w:val="en-US"/>
-        </w:rPr>
-        <w:t>Association for Computing Machinery. https://doi.org/10.1145/3460112.3471966</w:t>
-      </w:r>
-      <w:r>
-        <w:rPr>
-          <w:lang w:val="en-US"/>
-        </w:rPr>
-        <w:t>.</w:t>
+        <w:t xml:space="preserve">Beery, S., Cole, E., Parker, J., Perona, P., Winner, K. (2021): Species Distribution Modeling for Machine Learning Practitioners: A Review. In Proceedings of the 2021 ACM SIGCAS Conference on Computing and Sustainable Societies (COMPASS ’21) (pp. 213–225). </w:t>
+      </w:r>
+      <w:r>
+        <w:rPr>
+          <w:lang w:val="en-US"/>
+        </w:rPr>
+        <w:t>Association for Computing Machinery. https://doi.org/10.1145/3460112.3471966.</w:t>
       </w:r>
     </w:p>
     <w:p>
@@ -173,7 +155,15 @@
         <w:t>A.,</w:t>
       </w:r>
       <w:r>
-        <w:t xml:space="preserve"> Tischew, </w:t>
+        <w:t xml:space="preserve"> </w:t>
+      </w:r>
+      <w:proofErr w:type="spellStart"/>
+      <w:r>
+        <w:t>Tischew</w:t>
+      </w:r>
+      <w:proofErr w:type="spellEnd"/>
+      <w:r>
+        <w:t xml:space="preserve">, </w:t>
       </w:r>
       <w:r>
         <w:t>S.,</w:t>
@@ -196,9 +186,11 @@
       <w:r>
         <w:t xml:space="preserve">: </w:t>
       </w:r>
+      <w:proofErr w:type="spellStart"/>
       <w:r>
         <w:t>Renaturierungsökologie</w:t>
       </w:r>
+      <w:proofErr w:type="spellEnd"/>
       <w:r>
         <w:t xml:space="preserve">. </w:t>
       </w:r>
@@ -221,7 +213,31 @@
         <w:t>6210(</w:t>
       </w:r>
       <w:r>
-        <w:t xml:space="preserve">) Naturnahe Kalk-Trockenrasen und deren Verbuschungsstadien (Festuco-Brometalia): Kartieranleitungen in Nordrhein-Westfalen*. </w:t>
+        <w:t xml:space="preserve">) Naturnahe Kalk-Trockenrasen und deren </w:t>
+      </w:r>
+      <w:proofErr w:type="spellStart"/>
+      <w:r>
+        <w:t>Verbuschungsstadien</w:t>
+      </w:r>
+      <w:proofErr w:type="spellEnd"/>
+      <w:r>
+        <w:t xml:space="preserve"> (</w:t>
+      </w:r>
+      <w:proofErr w:type="spellStart"/>
+      <w:r>
+        <w:t>Festuco-Brometalia</w:t>
+      </w:r>
+      <w:proofErr w:type="spellEnd"/>
+      <w:r>
+        <w:t xml:space="preserve">): </w:t>
+      </w:r>
+      <w:proofErr w:type="spellStart"/>
+      <w:r>
+        <w:t>Kartieranleitungen</w:t>
+      </w:r>
+      <w:proofErr w:type="spellEnd"/>
+      <w:r>
+        <w:t xml:space="preserve"> in Nordrhein-Westfalen*. </w:t>
       </w:r>
       <w:hyperlink r:id="rId5" w:tgtFrame="_new" w:history="1">
         <w:r>
@@ -324,7 +340,63 @@
         <w:rPr>
           <w:lang w:val="en-US"/>
         </w:rPr>
-        <w:t xml:space="preserve">EU Action plan to maintain and restore to favourable conservation status the habitat type 6210 Semi-natural dry grasslands and scrubland facies on calcareous substrates (Festuco-Brometalia)(* important orchid sites). </w:t>
+        <w:t xml:space="preserve">EU Action plan to maintain and restore to </w:t>
+      </w:r>
+      <w:proofErr w:type="spellStart"/>
+      <w:r>
+        <w:rPr>
+          <w:lang w:val="en-US"/>
+        </w:rPr>
+        <w:t>favourable</w:t>
+      </w:r>
+      <w:proofErr w:type="spellEnd"/>
+      <w:r>
+        <w:rPr>
+          <w:lang w:val="en-US"/>
+        </w:rPr>
+        <w:t xml:space="preserve"> conservation status the habitat </w:t>
+      </w:r>
+      <w:proofErr w:type="gramStart"/>
+      <w:r>
+        <w:rPr>
+          <w:lang w:val="en-US"/>
+        </w:rPr>
+        <w:t>type</w:t>
+      </w:r>
+      <w:proofErr w:type="gramEnd"/>
+      <w:r>
+        <w:rPr>
+          <w:lang w:val="en-US"/>
+        </w:rPr>
+        <w:t xml:space="preserve"> 6210 Semi-natural dry grasslands and scrubland facies on calcareous substrates (</w:t>
+      </w:r>
+      <w:proofErr w:type="spellStart"/>
+      <w:r>
+        <w:rPr>
+          <w:lang w:val="en-US"/>
+        </w:rPr>
+        <w:t>Festuco-</w:t>
+      </w:r>
+      <w:proofErr w:type="gramStart"/>
+      <w:r>
+        <w:rPr>
+          <w:lang w:val="en-US"/>
+        </w:rPr>
+        <w:t>Brometalia</w:t>
+      </w:r>
+      <w:proofErr w:type="spellEnd"/>
+      <w:r>
+        <w:rPr>
+          <w:lang w:val="en-US"/>
+        </w:rPr>
+        <w:t>)(</w:t>
+      </w:r>
+      <w:proofErr w:type="gramEnd"/>
+      <w:r>
+        <w:rPr>
+          <w:lang w:val="en-US"/>
+        </w:rPr>
+        <w:t xml:space="preserve">* important orchid sites). </w:t>
       </w:r>
       <w:r>
         <w:rPr>
@@ -363,7 +435,21 @@
         <w:rPr>
           <w:lang w:val="en-US"/>
         </w:rPr>
-        <w:t>, Fartmann,</w:t>
+        <w:t xml:space="preserve">, </w:t>
+      </w:r>
+      <w:proofErr w:type="spellStart"/>
+      <w:r>
+        <w:rPr>
+          <w:lang w:val="en-US"/>
+        </w:rPr>
+        <w:t>Fartmann</w:t>
+      </w:r>
+      <w:proofErr w:type="spellEnd"/>
+      <w:r>
+        <w:rPr>
+          <w:lang w:val="en-US"/>
+        </w:rPr>
+        <w:t>,</w:t>
       </w:r>
       <w:r>
         <w:rPr>
@@ -457,19 +543,91 @@
         <w:rPr>
           <w:lang w:val="en-US"/>
         </w:rPr>
-        <w:t>Vassilev, K., Apostolova, I., Pedashenko, H. (2012)</w:t>
-      </w:r>
-      <w:r>
-        <w:rPr>
-          <w:lang w:val="en-US"/>
-        </w:rPr>
-        <w:t xml:space="preserve">: </w:t>
-      </w:r>
-      <w:r>
-        <w:rPr>
-          <w:lang w:val="en-US"/>
-        </w:rPr>
-        <w:t>Festuco-Brometea in Western Bulgaria with an emphasis on Cirsio-Brachypodion pinnati. Hacquetia, 11(2), 227–248. https://doi.org/10.2478/v10028-012-0011-4</w:t>
+        <w:t xml:space="preserve">Vassilev, K., </w:t>
+      </w:r>
+      <w:proofErr w:type="spellStart"/>
+      <w:r>
+        <w:rPr>
+          <w:lang w:val="en-US"/>
+        </w:rPr>
+        <w:t>Apostolova</w:t>
+      </w:r>
+      <w:proofErr w:type="spellEnd"/>
+      <w:r>
+        <w:rPr>
+          <w:lang w:val="en-US"/>
+        </w:rPr>
+        <w:t xml:space="preserve">, I., </w:t>
+      </w:r>
+      <w:proofErr w:type="spellStart"/>
+      <w:r>
+        <w:rPr>
+          <w:lang w:val="en-US"/>
+        </w:rPr>
+        <w:t>Pedashenko</w:t>
+      </w:r>
+      <w:proofErr w:type="spellEnd"/>
+      <w:r>
+        <w:rPr>
+          <w:lang w:val="en-US"/>
+        </w:rPr>
+        <w:t xml:space="preserve">, H. (2012): </w:t>
+      </w:r>
+      <w:proofErr w:type="spellStart"/>
+      <w:r>
+        <w:rPr>
+          <w:lang w:val="en-US"/>
+        </w:rPr>
+        <w:t>Festuco-Brometea</w:t>
+      </w:r>
+      <w:proofErr w:type="spellEnd"/>
+      <w:r>
+        <w:rPr>
+          <w:lang w:val="en-US"/>
+        </w:rPr>
+        <w:t xml:space="preserve"> in Western Bulgaria with an emphasis on </w:t>
+      </w:r>
+      <w:proofErr w:type="spellStart"/>
+      <w:r>
+        <w:rPr>
+          <w:lang w:val="en-US"/>
+        </w:rPr>
+        <w:t>Cirsio-Brachypodion</w:t>
+      </w:r>
+      <w:proofErr w:type="spellEnd"/>
+      <w:r>
+        <w:rPr>
+          <w:lang w:val="en-US"/>
+        </w:rPr>
+        <w:t xml:space="preserve"> </w:t>
+      </w:r>
+      <w:proofErr w:type="spellStart"/>
+      <w:r>
+        <w:rPr>
+          <w:lang w:val="en-US"/>
+        </w:rPr>
+        <w:t>pinnati</w:t>
+      </w:r>
+      <w:proofErr w:type="spellEnd"/>
+      <w:r>
+        <w:rPr>
+          <w:lang w:val="en-US"/>
+        </w:rPr>
+        <w:t xml:space="preserve">. </w:t>
+      </w:r>
+      <w:proofErr w:type="spellStart"/>
+      <w:r>
+        <w:rPr>
+          <w:lang w:val="en-US"/>
+        </w:rPr>
+        <w:t>Hacquetia</w:t>
+      </w:r>
+      <w:proofErr w:type="spellEnd"/>
+      <w:r>
+        <w:rPr>
+          <w:lang w:val="en-US"/>
+        </w:rPr>
+        <w:t>, 11(2), 227–248. https://doi.org/10.2478/v10028-012-0011-4</w:t>
       </w:r>
       <w:r>
         <w:rPr>
@@ -513,6 +671,7 @@
         <w:t>.</w:t>
       </w:r>
     </w:p>
+    <w:p/>
     <w:p>
       <w:r>
         <w:br w:type="column"/>
@@ -536,20 +695,66 @@
         <w:t xml:space="preserve"> -</w:t>
       </w:r>
       <w:r>
-        <w:t xml:space="preserve"> Dreizähniges Knabenkraut (</w:t>
-      </w:r>
+        <w:t xml:space="preserve"> </w:t>
+      </w:r>
+      <w:proofErr w:type="spellStart"/>
+      <w:r>
+        <w:t>Dreizähniges</w:t>
+      </w:r>
+      <w:proofErr w:type="spellEnd"/>
+      <w:r>
+        <w:t xml:space="preserve"> Knabenkraut (</w:t>
+      </w:r>
+      <w:proofErr w:type="spellStart"/>
       <w:r>
         <w:rPr>
           <w:i/>
           <w:iCs/>
         </w:rPr>
-        <w:t>Neotinea tridentata</w:t>
-      </w:r>
+        <w:t>Neotinea</w:t>
+      </w:r>
+      <w:proofErr w:type="spellEnd"/>
+      <w:r>
+        <w:rPr>
+          <w:i/>
+          <w:iCs/>
+        </w:rPr>
+        <w:t xml:space="preserve"> </w:t>
+      </w:r>
+      <w:proofErr w:type="spellStart"/>
+      <w:r>
+        <w:rPr>
+          <w:i/>
+          <w:iCs/>
+        </w:rPr>
+        <w:t>tridentata</w:t>
+      </w:r>
+      <w:proofErr w:type="spellEnd"/>
       <w:r>
         <w:t>)</w:t>
       </w:r>
       <w:r>
         <w:t>:</w:t>
+      </w:r>
+      <w:r>
+        <w:t xml:space="preserve"> </w:t>
+      </w:r>
+      <w:r>
+        <w:t>Dominik Poniatowski</w:t>
+      </w:r>
+      <w:r>
+        <w:t xml:space="preserve"> </w:t>
+      </w:r>
+      <w:hyperlink r:id="rId8" w:history="1">
+        <w:r>
+          <w:rPr>
+            <w:rStyle w:val="Hyperlink"/>
+          </w:rPr>
+          <w:t>https://kalkmagerrasen.net/</w:t>
+        </w:r>
+      </w:hyperlink>
+      <w:r>
+        <w:t xml:space="preserve"> </w:t>
       </w:r>
     </w:p>
     <w:p>
@@ -559,16 +764,30 @@
       <w:r>
         <w:t xml:space="preserve"> - </w:t>
       </w:r>
-      <w:r>
-        <w:t>Erdsegge (</w:t>
+      <w:proofErr w:type="spellStart"/>
+      <w:r>
+        <w:t>Erdsegge</w:t>
+      </w:r>
+      <w:proofErr w:type="spellEnd"/>
+      <w:r>
+        <w:t xml:space="preserve"> (</w:t>
       </w:r>
       <w:r>
         <w:rPr>
           <w:i/>
           <w:iCs/>
         </w:rPr>
-        <w:t>Carex humilis</w:t>
-      </w:r>
+        <w:t xml:space="preserve">Carex </w:t>
+      </w:r>
+      <w:proofErr w:type="spellStart"/>
+      <w:r>
+        <w:rPr>
+          <w:i/>
+          <w:iCs/>
+        </w:rPr>
+        <w:t>humilis</w:t>
+      </w:r>
+      <w:proofErr w:type="spellEnd"/>
       <w:r>
         <w:t>)</w:t>
       </w:r>
@@ -577,6 +796,16 @@
       </w:r>
     </w:p>
     <w:p>
+      <w:hyperlink r:id="rId9" w:history="1">
+        <w:r>
+          <w:rPr>
+            <w:rStyle w:val="Hyperlink"/>
+          </w:rPr>
+          <w:t>https://commons.wikimedia.org/wiki/File:Carex_humilis.jpg</w:t>
+        </w:r>
+      </w:hyperlink>
+    </w:p>
+    <w:p>
       <w:r>
         <w:t>unt</w:t>
       </w:r>
@@ -589,19 +818,60 @@
       <w:r>
         <w:t>Thymian-Ameisenbläuling (</w:t>
       </w:r>
+      <w:proofErr w:type="spellStart"/>
       <w:r>
         <w:rPr>
           <w:i/>
           <w:iCs/>
         </w:rPr>
-        <w:t>Phengaris arion</w:t>
-      </w:r>
+        <w:t>Phengaris</w:t>
+      </w:r>
+      <w:proofErr w:type="spellEnd"/>
+      <w:r>
+        <w:rPr>
+          <w:i/>
+          <w:iCs/>
+        </w:rPr>
+        <w:t xml:space="preserve"> </w:t>
+      </w:r>
+      <w:proofErr w:type="spellStart"/>
+      <w:r>
+        <w:rPr>
+          <w:i/>
+          <w:iCs/>
+        </w:rPr>
+        <w:t>arion</w:t>
+      </w:r>
+      <w:proofErr w:type="spellEnd"/>
       <w:r>
         <w:t>)</w:t>
       </w:r>
       <w:r>
         <w:t>:</w:t>
       </w:r>
+    </w:p>
+    <w:p>
+      <w:proofErr w:type="spellStart"/>
+      <w:proofErr w:type="gramStart"/>
+      <w:r>
+        <w:t>Foto:</w:t>
+      </w:r>
+      <w:r>
+        <w:t>Thomas</w:t>
+      </w:r>
+      <w:proofErr w:type="spellEnd"/>
+      <w:proofErr w:type="gramEnd"/>
+      <w:r>
+        <w:t xml:space="preserve"> Fartmann </w:t>
+      </w:r>
+      <w:hyperlink r:id="rId10" w:history="1">
+        <w:r>
+          <w:rPr>
+            <w:rStyle w:val="Hyperlink"/>
+          </w:rPr>
+          <w:t>https://kalkmagerrasen.net/</w:t>
+        </w:r>
+      </w:hyperlink>
     </w:p>
     <w:p>
       <w:pPr>
@@ -616,12 +886,21 @@
       <w:r>
         <w:t>Zauneidechse (</w:t>
       </w:r>
+      <w:proofErr w:type="spellStart"/>
       <w:r>
         <w:rPr>
           <w:i/>
           <w:iCs/>
         </w:rPr>
-        <w:t>Lacerta agilis</w:t>
+        <w:t>Lacerta</w:t>
+      </w:r>
+      <w:proofErr w:type="spellEnd"/>
+      <w:r>
+        <w:rPr>
+          <w:i/>
+          <w:iCs/>
+        </w:rPr>
+        <w:t xml:space="preserve"> agilis</w:t>
       </w:r>
       <w:r>
         <w:t>)</w:t>
@@ -1069,15 +1348,15 @@
     <w:lsdException w:name="Unresolved Mention" w:semiHidden="1" w:unhideWhenUsed="1"/>
     <w:lsdException w:name="Smart Link" w:semiHidden="1" w:unhideWhenUsed="1"/>
   </w:latentStyles>
-  <w:style w:type="paragraph" w:default="1" w:styleId="Normal">
+  <w:style w:type="paragraph" w:default="1" w:styleId="Standard">
     <w:name w:val="Normal"/>
     <w:qFormat/>
   </w:style>
-  <w:style w:type="paragraph" w:styleId="Heading1">
+  <w:style w:type="paragraph" w:styleId="berschrift1">
     <w:name w:val="heading 1"/>
-    <w:basedOn w:val="Normal"/>
-    <w:next w:val="Normal"/>
-    <w:link w:val="Heading1Char"/>
+    <w:basedOn w:val="Standard"/>
+    <w:next w:val="Standard"/>
+    <w:link w:val="berschrift1Zchn"/>
     <w:uiPriority w:val="9"/>
     <w:qFormat/>
     <w:rsid w:val="008D1714"/>
@@ -1094,11 +1373,11 @@
       <w:szCs w:val="40"/>
     </w:rPr>
   </w:style>
-  <w:style w:type="paragraph" w:styleId="Heading2">
+  <w:style w:type="paragraph" w:styleId="berschrift2">
     <w:name w:val="heading 2"/>
-    <w:basedOn w:val="Normal"/>
-    <w:next w:val="Normal"/>
-    <w:link w:val="Heading2Char"/>
+    <w:basedOn w:val="Standard"/>
+    <w:next w:val="Standard"/>
+    <w:link w:val="berschrift2Zchn"/>
     <w:uiPriority w:val="9"/>
     <w:semiHidden/>
     <w:unhideWhenUsed/>
@@ -1117,11 +1396,11 @@
       <w:szCs w:val="32"/>
     </w:rPr>
   </w:style>
-  <w:style w:type="paragraph" w:styleId="Heading3">
+  <w:style w:type="paragraph" w:styleId="berschrift3">
     <w:name w:val="heading 3"/>
-    <w:basedOn w:val="Normal"/>
-    <w:next w:val="Normal"/>
-    <w:link w:val="Heading3Char"/>
+    <w:basedOn w:val="Standard"/>
+    <w:next w:val="Standard"/>
+    <w:link w:val="berschrift3Zchn"/>
     <w:uiPriority w:val="9"/>
     <w:semiHidden/>
     <w:unhideWhenUsed/>
@@ -1140,11 +1419,11 @@
       <w:szCs w:val="28"/>
     </w:rPr>
   </w:style>
-  <w:style w:type="paragraph" w:styleId="Heading4">
+  <w:style w:type="paragraph" w:styleId="berschrift4">
     <w:name w:val="heading 4"/>
-    <w:basedOn w:val="Normal"/>
-    <w:next w:val="Normal"/>
-    <w:link w:val="Heading4Char"/>
+    <w:basedOn w:val="Standard"/>
+    <w:next w:val="Standard"/>
+    <w:link w:val="berschrift4Zchn"/>
     <w:uiPriority w:val="9"/>
     <w:semiHidden/>
     <w:unhideWhenUsed/>
@@ -1163,11 +1442,11 @@
       <w:color w:val="2F5496" w:themeColor="accent1" w:themeShade="BF"/>
     </w:rPr>
   </w:style>
-  <w:style w:type="paragraph" w:styleId="Heading5">
+  <w:style w:type="paragraph" w:styleId="berschrift5">
     <w:name w:val="heading 5"/>
-    <w:basedOn w:val="Normal"/>
-    <w:next w:val="Normal"/>
-    <w:link w:val="Heading5Char"/>
+    <w:basedOn w:val="Standard"/>
+    <w:next w:val="Standard"/>
+    <w:link w:val="berschrift5Zchn"/>
     <w:uiPriority w:val="9"/>
     <w:semiHidden/>
     <w:unhideWhenUsed/>
@@ -1184,11 +1463,11 @@
       <w:color w:val="2F5496" w:themeColor="accent1" w:themeShade="BF"/>
     </w:rPr>
   </w:style>
-  <w:style w:type="paragraph" w:styleId="Heading6">
+  <w:style w:type="paragraph" w:styleId="berschrift6">
     <w:name w:val="heading 6"/>
-    <w:basedOn w:val="Normal"/>
-    <w:next w:val="Normal"/>
-    <w:link w:val="Heading6Char"/>
+    <w:basedOn w:val="Standard"/>
+    <w:next w:val="Standard"/>
+    <w:link w:val="berschrift6Zchn"/>
     <w:uiPriority w:val="9"/>
     <w:semiHidden/>
     <w:unhideWhenUsed/>
@@ -1207,11 +1486,11 @@
       <w:color w:val="595959" w:themeColor="text1" w:themeTint="A6"/>
     </w:rPr>
   </w:style>
-  <w:style w:type="paragraph" w:styleId="Heading7">
+  <w:style w:type="paragraph" w:styleId="berschrift7">
     <w:name w:val="heading 7"/>
-    <w:basedOn w:val="Normal"/>
-    <w:next w:val="Normal"/>
-    <w:link w:val="Heading7Char"/>
+    <w:basedOn w:val="Standard"/>
+    <w:next w:val="Standard"/>
+    <w:link w:val="berschrift7Zchn"/>
     <w:uiPriority w:val="9"/>
     <w:semiHidden/>
     <w:unhideWhenUsed/>
@@ -1228,11 +1507,11 @@
       <w:color w:val="595959" w:themeColor="text1" w:themeTint="A6"/>
     </w:rPr>
   </w:style>
-  <w:style w:type="paragraph" w:styleId="Heading8">
+  <w:style w:type="paragraph" w:styleId="berschrift8">
     <w:name w:val="heading 8"/>
-    <w:basedOn w:val="Normal"/>
-    <w:next w:val="Normal"/>
-    <w:link w:val="Heading8Char"/>
+    <w:basedOn w:val="Standard"/>
+    <w:next w:val="Standard"/>
+    <w:link w:val="berschrift8Zchn"/>
     <w:uiPriority w:val="9"/>
     <w:semiHidden/>
     <w:unhideWhenUsed/>
@@ -1251,11 +1530,11 @@
       <w:color w:val="272727" w:themeColor="text1" w:themeTint="D8"/>
     </w:rPr>
   </w:style>
-  <w:style w:type="paragraph" w:styleId="Heading9">
+  <w:style w:type="paragraph" w:styleId="berschrift9">
     <w:name w:val="heading 9"/>
-    <w:basedOn w:val="Normal"/>
-    <w:next w:val="Normal"/>
-    <w:link w:val="Heading9Char"/>
+    <w:basedOn w:val="Standard"/>
+    <w:next w:val="Standard"/>
+    <w:link w:val="berschrift9Zchn"/>
     <w:uiPriority w:val="9"/>
     <w:semiHidden/>
     <w:unhideWhenUsed/>
@@ -1272,12 +1551,13 @@
       <w:color w:val="272727" w:themeColor="text1" w:themeTint="D8"/>
     </w:rPr>
   </w:style>
-  <w:style w:type="character" w:default="1" w:styleId="DefaultParagraphFont">
+  <w:style w:type="character" w:default="1" w:styleId="Absatz-Standardschriftart">
     <w:name w:val="Default Paragraph Font"/>
     <w:uiPriority w:val="1"/>
+    <w:semiHidden/>
     <w:unhideWhenUsed/>
   </w:style>
-  <w:style w:type="table" w:default="1" w:styleId="TableNormal">
+  <w:style w:type="table" w:default="1" w:styleId="NormaleTabelle">
     <w:name w:val="Normal Table"/>
     <w:uiPriority w:val="99"/>
     <w:semiHidden/>
@@ -1292,16 +1572,16 @@
       </w:tblCellMar>
     </w:tblPr>
   </w:style>
-  <w:style w:type="numbering" w:default="1" w:styleId="NoList">
+  <w:style w:type="numbering" w:default="1" w:styleId="KeineListe">
     <w:name w:val="No List"/>
     <w:uiPriority w:val="99"/>
     <w:semiHidden/>
     <w:unhideWhenUsed/>
   </w:style>
-  <w:style w:type="character" w:customStyle="1" w:styleId="Heading1Char">
-    <w:name w:val="Heading 1 Char"/>
-    <w:basedOn w:val="DefaultParagraphFont"/>
-    <w:link w:val="Heading1"/>
+  <w:style w:type="character" w:customStyle="1" w:styleId="berschrift1Zchn">
+    <w:name w:val="Überschrift 1 Zchn"/>
+    <w:basedOn w:val="Absatz-Standardschriftart"/>
+    <w:link w:val="berschrift1"/>
     <w:uiPriority w:val="9"/>
     <w:rsid w:val="008D1714"/>
     <w:rPr>
@@ -1311,10 +1591,10 @@
       <w:szCs w:val="40"/>
     </w:rPr>
   </w:style>
-  <w:style w:type="character" w:customStyle="1" w:styleId="Heading2Char">
-    <w:name w:val="Heading 2 Char"/>
-    <w:basedOn w:val="DefaultParagraphFont"/>
-    <w:link w:val="Heading2"/>
+  <w:style w:type="character" w:customStyle="1" w:styleId="berschrift2Zchn">
+    <w:name w:val="Überschrift 2 Zchn"/>
+    <w:basedOn w:val="Absatz-Standardschriftart"/>
+    <w:link w:val="berschrift2"/>
     <w:uiPriority w:val="9"/>
     <w:semiHidden/>
     <w:rsid w:val="008D1714"/>
@@ -1325,10 +1605,10 @@
       <w:szCs w:val="32"/>
     </w:rPr>
   </w:style>
-  <w:style w:type="character" w:customStyle="1" w:styleId="Heading3Char">
-    <w:name w:val="Heading 3 Char"/>
-    <w:basedOn w:val="DefaultParagraphFont"/>
-    <w:link w:val="Heading3"/>
+  <w:style w:type="character" w:customStyle="1" w:styleId="berschrift3Zchn">
+    <w:name w:val="Überschrift 3 Zchn"/>
+    <w:basedOn w:val="Absatz-Standardschriftart"/>
+    <w:link w:val="berschrift3"/>
     <w:uiPriority w:val="9"/>
     <w:semiHidden/>
     <w:rsid w:val="008D1714"/>
@@ -1339,10 +1619,10 @@
       <w:szCs w:val="28"/>
     </w:rPr>
   </w:style>
-  <w:style w:type="character" w:customStyle="1" w:styleId="Heading4Char">
-    <w:name w:val="Heading 4 Char"/>
-    <w:basedOn w:val="DefaultParagraphFont"/>
-    <w:link w:val="Heading4"/>
+  <w:style w:type="character" w:customStyle="1" w:styleId="berschrift4Zchn">
+    <w:name w:val="Überschrift 4 Zchn"/>
+    <w:basedOn w:val="Absatz-Standardschriftart"/>
+    <w:link w:val="berschrift4"/>
     <w:uiPriority w:val="9"/>
     <w:semiHidden/>
     <w:rsid w:val="008D1714"/>
@@ -1353,10 +1633,10 @@
       <w:color w:val="2F5496" w:themeColor="accent1" w:themeShade="BF"/>
     </w:rPr>
   </w:style>
-  <w:style w:type="character" w:customStyle="1" w:styleId="Heading5Char">
-    <w:name w:val="Heading 5 Char"/>
-    <w:basedOn w:val="DefaultParagraphFont"/>
-    <w:link w:val="Heading5"/>
+  <w:style w:type="character" w:customStyle="1" w:styleId="berschrift5Zchn">
+    <w:name w:val="Überschrift 5 Zchn"/>
+    <w:basedOn w:val="Absatz-Standardschriftart"/>
+    <w:link w:val="berschrift5"/>
     <w:uiPriority w:val="9"/>
     <w:semiHidden/>
     <w:rsid w:val="008D1714"/>
@@ -1365,10 +1645,10 @@
       <w:color w:val="2F5496" w:themeColor="accent1" w:themeShade="BF"/>
     </w:rPr>
   </w:style>
-  <w:style w:type="character" w:customStyle="1" w:styleId="Heading6Char">
-    <w:name w:val="Heading 6 Char"/>
-    <w:basedOn w:val="DefaultParagraphFont"/>
-    <w:link w:val="Heading6"/>
+  <w:style w:type="character" w:customStyle="1" w:styleId="berschrift6Zchn">
+    <w:name w:val="Überschrift 6 Zchn"/>
+    <w:basedOn w:val="Absatz-Standardschriftart"/>
+    <w:link w:val="berschrift6"/>
     <w:uiPriority w:val="9"/>
     <w:semiHidden/>
     <w:rsid w:val="008D1714"/>
@@ -1379,10 +1659,10 @@
       <w:color w:val="595959" w:themeColor="text1" w:themeTint="A6"/>
     </w:rPr>
   </w:style>
-  <w:style w:type="character" w:customStyle="1" w:styleId="Heading7Char">
-    <w:name w:val="Heading 7 Char"/>
-    <w:basedOn w:val="DefaultParagraphFont"/>
-    <w:link w:val="Heading7"/>
+  <w:style w:type="character" w:customStyle="1" w:styleId="berschrift7Zchn">
+    <w:name w:val="Überschrift 7 Zchn"/>
+    <w:basedOn w:val="Absatz-Standardschriftart"/>
+    <w:link w:val="berschrift7"/>
     <w:uiPriority w:val="9"/>
     <w:semiHidden/>
     <w:rsid w:val="008D1714"/>
@@ -1391,10 +1671,10 @@
       <w:color w:val="595959" w:themeColor="text1" w:themeTint="A6"/>
     </w:rPr>
   </w:style>
-  <w:style w:type="character" w:customStyle="1" w:styleId="Heading8Char">
-    <w:name w:val="Heading 8 Char"/>
-    <w:basedOn w:val="DefaultParagraphFont"/>
-    <w:link w:val="Heading8"/>
+  <w:style w:type="character" w:customStyle="1" w:styleId="berschrift8Zchn">
+    <w:name w:val="Überschrift 8 Zchn"/>
+    <w:basedOn w:val="Absatz-Standardschriftart"/>
+    <w:link w:val="berschrift8"/>
     <w:uiPriority w:val="9"/>
     <w:semiHidden/>
     <w:rsid w:val="008D1714"/>
@@ -1405,10 +1685,10 @@
       <w:color w:val="272727" w:themeColor="text1" w:themeTint="D8"/>
     </w:rPr>
   </w:style>
-  <w:style w:type="character" w:customStyle="1" w:styleId="Heading9Char">
-    <w:name w:val="Heading 9 Char"/>
-    <w:basedOn w:val="DefaultParagraphFont"/>
-    <w:link w:val="Heading9"/>
+  <w:style w:type="character" w:customStyle="1" w:styleId="berschrift9Zchn">
+    <w:name w:val="Überschrift 9 Zchn"/>
+    <w:basedOn w:val="Absatz-Standardschriftart"/>
+    <w:link w:val="berschrift9"/>
     <w:uiPriority w:val="9"/>
     <w:semiHidden/>
     <w:rsid w:val="008D1714"/>
@@ -1417,11 +1697,11 @@
       <w:color w:val="272727" w:themeColor="text1" w:themeTint="D8"/>
     </w:rPr>
   </w:style>
-  <w:style w:type="paragraph" w:styleId="Title">
+  <w:style w:type="paragraph" w:styleId="Titel">
     <w:name w:val="Title"/>
-    <w:basedOn w:val="Normal"/>
-    <w:next w:val="Normal"/>
-    <w:link w:val="TitleChar"/>
+    <w:basedOn w:val="Standard"/>
+    <w:next w:val="Standard"/>
+    <w:link w:val="TitelZchn"/>
     <w:uiPriority w:val="10"/>
     <w:qFormat/>
     <w:rsid w:val="008D1714"/>
@@ -1437,10 +1717,10 @@
       <w:szCs w:val="56"/>
     </w:rPr>
   </w:style>
-  <w:style w:type="character" w:customStyle="1" w:styleId="TitleChar">
-    <w:name w:val="Title Char"/>
-    <w:basedOn w:val="DefaultParagraphFont"/>
-    <w:link w:val="Title"/>
+  <w:style w:type="character" w:customStyle="1" w:styleId="TitelZchn">
+    <w:name w:val="Titel Zchn"/>
+    <w:basedOn w:val="Absatz-Standardschriftart"/>
+    <w:link w:val="Titel"/>
     <w:uiPriority w:val="10"/>
     <w:rsid w:val="008D1714"/>
     <w:rPr>
@@ -1451,11 +1731,11 @@
       <w:szCs w:val="56"/>
     </w:rPr>
   </w:style>
-  <w:style w:type="paragraph" w:styleId="Subtitle">
+  <w:style w:type="paragraph" w:styleId="Untertitel">
     <w:name w:val="Subtitle"/>
-    <w:basedOn w:val="Normal"/>
-    <w:next w:val="Normal"/>
-    <w:link w:val="SubtitleChar"/>
+    <w:basedOn w:val="Standard"/>
+    <w:next w:val="Standard"/>
+    <w:link w:val="UntertitelZchn"/>
     <w:uiPriority w:val="11"/>
     <w:qFormat/>
     <w:rsid w:val="008D1714"/>
@@ -1472,10 +1752,10 @@
       <w:szCs w:val="28"/>
     </w:rPr>
   </w:style>
-  <w:style w:type="character" w:customStyle="1" w:styleId="SubtitleChar">
-    <w:name w:val="Subtitle Char"/>
-    <w:basedOn w:val="DefaultParagraphFont"/>
-    <w:link w:val="Subtitle"/>
+  <w:style w:type="character" w:customStyle="1" w:styleId="UntertitelZchn">
+    <w:name w:val="Untertitel Zchn"/>
+    <w:basedOn w:val="Absatz-Standardschriftart"/>
+    <w:link w:val="Untertitel"/>
     <w:uiPriority w:val="11"/>
     <w:rsid w:val="008D1714"/>
     <w:rPr>
@@ -1486,11 +1766,11 @@
       <w:szCs w:val="28"/>
     </w:rPr>
   </w:style>
-  <w:style w:type="paragraph" w:styleId="Quote">
+  <w:style w:type="paragraph" w:styleId="Zitat">
     <w:name w:val="Quote"/>
-    <w:basedOn w:val="Normal"/>
-    <w:next w:val="Normal"/>
-    <w:link w:val="QuoteChar"/>
+    <w:basedOn w:val="Standard"/>
+    <w:next w:val="Standard"/>
+    <w:link w:val="ZitatZchn"/>
     <w:uiPriority w:val="29"/>
     <w:qFormat/>
     <w:rsid w:val="008D1714"/>
@@ -1504,10 +1784,10 @@
       <w:color w:val="404040" w:themeColor="text1" w:themeTint="BF"/>
     </w:rPr>
   </w:style>
-  <w:style w:type="character" w:customStyle="1" w:styleId="QuoteChar">
-    <w:name w:val="Quote Char"/>
-    <w:basedOn w:val="DefaultParagraphFont"/>
-    <w:link w:val="Quote"/>
+  <w:style w:type="character" w:customStyle="1" w:styleId="ZitatZchn">
+    <w:name w:val="Zitat Zchn"/>
+    <w:basedOn w:val="Absatz-Standardschriftart"/>
+    <w:link w:val="Zitat"/>
     <w:uiPriority w:val="29"/>
     <w:rsid w:val="008D1714"/>
     <w:rPr>
@@ -1516,9 +1796,9 @@
       <w:color w:val="404040" w:themeColor="text1" w:themeTint="BF"/>
     </w:rPr>
   </w:style>
-  <w:style w:type="paragraph" w:styleId="ListParagraph">
+  <w:style w:type="paragraph" w:styleId="Listenabsatz">
     <w:name w:val="List Paragraph"/>
-    <w:basedOn w:val="Normal"/>
+    <w:basedOn w:val="Standard"/>
     <w:uiPriority w:val="34"/>
     <w:qFormat/>
     <w:rsid w:val="008D1714"/>
@@ -1527,9 +1807,9 @@
       <w:contextualSpacing/>
     </w:pPr>
   </w:style>
-  <w:style w:type="character" w:styleId="IntenseEmphasis">
+  <w:style w:type="character" w:styleId="IntensiveHervorhebung">
     <w:name w:val="Intense Emphasis"/>
-    <w:basedOn w:val="DefaultParagraphFont"/>
+    <w:basedOn w:val="Absatz-Standardschriftart"/>
     <w:uiPriority w:val="21"/>
     <w:qFormat/>
     <w:rsid w:val="008D1714"/>
@@ -1539,11 +1819,11 @@
       <w:color w:val="2F5496" w:themeColor="accent1" w:themeShade="BF"/>
     </w:rPr>
   </w:style>
-  <w:style w:type="paragraph" w:styleId="IntenseQuote">
+  <w:style w:type="paragraph" w:styleId="IntensivesZitat">
     <w:name w:val="Intense Quote"/>
-    <w:basedOn w:val="Normal"/>
-    <w:next w:val="Normal"/>
-    <w:link w:val="IntenseQuoteChar"/>
+    <w:basedOn w:val="Standard"/>
+    <w:next w:val="Standard"/>
+    <w:link w:val="IntensivesZitatZchn"/>
     <w:uiPriority w:val="30"/>
     <w:qFormat/>
     <w:rsid w:val="008D1714"/>
@@ -1562,10 +1842,10 @@
       <w:color w:val="2F5496" w:themeColor="accent1" w:themeShade="BF"/>
     </w:rPr>
   </w:style>
-  <w:style w:type="character" w:customStyle="1" w:styleId="IntenseQuoteChar">
-    <w:name w:val="Intense Quote Char"/>
-    <w:basedOn w:val="DefaultParagraphFont"/>
-    <w:link w:val="IntenseQuote"/>
+  <w:style w:type="character" w:customStyle="1" w:styleId="IntensivesZitatZchn">
+    <w:name w:val="Intensives Zitat Zchn"/>
+    <w:basedOn w:val="Absatz-Standardschriftart"/>
+    <w:link w:val="IntensivesZitat"/>
     <w:uiPriority w:val="30"/>
     <w:rsid w:val="008D1714"/>
     <w:rPr>
@@ -1574,9 +1854,9 @@
       <w:color w:val="2F5496" w:themeColor="accent1" w:themeShade="BF"/>
     </w:rPr>
   </w:style>
-  <w:style w:type="character" w:styleId="IntenseReference">
+  <w:style w:type="character" w:styleId="IntensiverVerweis">
     <w:name w:val="Intense Reference"/>
-    <w:basedOn w:val="DefaultParagraphFont"/>
+    <w:basedOn w:val="Absatz-Standardschriftart"/>
     <w:uiPriority w:val="32"/>
     <w:qFormat/>
     <w:rsid w:val="008D1714"/>
@@ -1590,7 +1870,7 @@
   </w:style>
   <w:style w:type="character" w:styleId="Hyperlink">
     <w:name w:val="Hyperlink"/>
-    <w:basedOn w:val="DefaultParagraphFont"/>
+    <w:basedOn w:val="Absatz-Standardschriftart"/>
     <w:uiPriority w:val="99"/>
     <w:unhideWhenUsed/>
     <w:rsid w:val="00803843"/>
@@ -1599,9 +1879,9 @@
       <w:u w:val="single"/>
     </w:rPr>
   </w:style>
-  <w:style w:type="character" w:styleId="UnresolvedMention">
+  <w:style w:type="character" w:styleId="NichtaufgelsteErwhnung">
     <w:name w:val="Unresolved Mention"/>
-    <w:basedOn w:val="DefaultParagraphFont"/>
+    <w:basedOn w:val="Absatz-Standardschriftart"/>
     <w:uiPriority w:val="99"/>
     <w:semiHidden/>
     <w:unhideWhenUsed/>

</xml_diff>